<commit_message>
Arquitectura Clase 2: entregable al final, "Taller" deja de nombrarse fijo, mas teoria
Reordena build_pptx (comun a las 15 clases): el bloque "PI CloudLite -
entregable de hoy" (que califica) pasa de ir justo despues de Objetivos a ir
justo antes de la practica, para no anunciar la nota antes de explicar el
concepto. La diapositiva final de practica deja de llamarse "Taller PI" ->
"Manos a la obra": el taller es variable, lo decide el docente clase a clase,
igual que ya se hizo con ExamLab/quiz en el resto de cursos.

Se agrega una diapositiva de teoria que faltaba (Responsabilidad compartida,
vendor lock-in) con contenido que ya estaba en el fundamento del guion pero
nunca se proyectaba.

Verificado con SOLO_CLASES=2: _verificar_mapa pasa, verificar_generico.py sin
fallos, render a PDF confirma el nuevo orden y que la diapositiva nueva no se
desborda.
</commit_message>
<xml_diff>
--- a/Arquitectura de Sistemas Computacionales/Kit docente/Clase 2/Guion Docente Clase 2 - Modelos de servicio IaaS PaaS SaaS.docx
+++ b/Arquitectura de Sistemas Computacionales/Kit docente/Clase 2/Guion Docente Clase 2 - Modelos de servicio IaaS PaaS SaaS.docx
@@ -248,7 +248,7 @@
           <w:color w:val="1A1C1D"/>
           <w:sz w:val="32"/>
         </w:rPr>
-        <w:t>De que se parte y que se decide hoy - diapositiva 4</w:t>
+        <w:t>De que se parte y que se decide hoy - diapositiva 11</w:t>
       </w:r>
     </w:p>
     <w:p>
@@ -271,7 +271,7 @@
           <w:color w:val="1A1C1D"/>
           <w:sz w:val="32"/>
         </w:rPr>
-        <w:t>La pila de responsabilidades: donde se corta la linea - diapositiva 5</w:t>
+        <w:t>La pila de responsabilidades: donde se corta la linea - diapositiva 4</w:t>
       </w:r>
     </w:p>
     <w:p>
@@ -294,7 +294,7 @@
           <w:color w:val="1A1C1D"/>
           <w:sz w:val="32"/>
         </w:rPr>
-        <w:t>IaaS, PaaS y SaaS: los tres cortes, uno por uno - diapositiva 5</w:t>
+        <w:t>IaaS, PaaS y SaaS: los tres cortes, uno por uno - diapositiva 4</w:t>
       </w:r>
     </w:p>
     <w:p>
@@ -337,7 +337,7 @@
           <w:color w:val="1A1C1D"/>
           <w:sz w:val="32"/>
         </w:rPr>
-        <w:t>Responsabilidad compartida: quien responde por que - diapositiva 6</w:t>
+        <w:t>Responsabilidad compartida: quien responde por que - diapositiva 5</w:t>
       </w:r>
     </w:p>
     <w:p>
@@ -416,7 +416,7 @@
           <w:color w:val="1A1C1D"/>
           <w:sz w:val="32"/>
         </w:rPr>
-        <w:t>Preguntas frecuentes y cierre conceptual (de la diapositiva 5 a la diapositiva 9)</w:t>
+        <w:t>Preguntas frecuentes y cierre conceptual (de la diapositiva 4 a la diapositiva 9)</w:t>
       </w:r>
     </w:p>
     <w:p>
@@ -538,19 +538,6 @@
           <w:color w:val="4A4A49"/>
           <w:sz w:val="22"/>
         </w:rPr>
-        <w:t>PI CloudLite — entregable de hoy</w:t>
-      </w:r>
-    </w:p>
-    <w:p>
-      <w:pPr>
-        <w:pStyle w:val="ListNumber"/>
-      </w:pPr>
-      <w:r>
-        <w:rPr>
-          <w:b w:val="0"/>
-          <w:color w:val="4A4A49"/>
-          <w:sz w:val="22"/>
-        </w:rPr>
         <w:t>IaaS · PaaS · SaaS (sin cloud de pago)</w:t>
       </w:r>
     </w:p>
@@ -565,6 +552,19 @@
           <w:sz w:val="22"/>
         </w:rPr>
         <w:t>Cómo decidir para CloudLite</w:t>
+      </w:r>
+    </w:p>
+    <w:p>
+      <w:pPr>
+        <w:pStyle w:val="ListNumber"/>
+      </w:pPr>
+      <w:r>
+        <w:rPr>
+          <w:b w:val="0"/>
+          <w:color w:val="4A4A49"/>
+          <w:sz w:val="22"/>
+        </w:rPr>
+        <w:t>Responsabilidad compartida: quién responde por qué</w:t>
       </w:r>
     </w:p>
     <w:p>
@@ -629,7 +629,20 @@
           <w:color w:val="4A4A49"/>
           <w:sz w:val="22"/>
         </w:rPr>
-        <w:t>Taller PI (paso a paso)</w:t>
+        <w:t>PI CloudLite — entregable de hoy</w:t>
+      </w:r>
+    </w:p>
+    <w:p>
+      <w:pPr>
+        <w:pStyle w:val="ListNumber"/>
+      </w:pPr>
+      <w:r>
+        <w:rPr>
+          <w:b w:val="0"/>
+          <w:color w:val="4A4A49"/>
+          <w:sz w:val="22"/>
+        </w:rPr>
+        <w:t>Manos a la obra (paso a paso)</w:t>
       </w:r>
     </w:p>
     <w:p>
@@ -681,7 +694,7 @@
           <w:color w:val="1A1C1D"/>
           <w:sz w:val="32"/>
         </w:rPr>
-        <w:t>0–10 · Encuadre PI · [Slide 2][Slide 3][Slide 4]</w:t>
+        <w:t>0–10 · Encuadre PI · [Slide 2][Slide 3][Slide 11]</w:t>
       </w:r>
     </w:p>
     <w:p>
@@ -760,7 +773,7 @@
           <w:color w:val="1A1C1D"/>
           <w:sz w:val="32"/>
         </w:rPr>
-        <w:t>10–40 · Teoría Core (al servicio del taller) · desde [Slide 5]</w:t>
+        <w:t>10–40 · Teoría Core (al servicio del taller) · desde [Slide 4]</w:t>
       </w:r>
     </w:p>
     <w:p>
@@ -770,7 +783,7 @@
           <w:color w:val="4A4A49"/>
           <w:sz w:val="22"/>
         </w:rPr>
-        <w:t>Cubre estos conceptos, en este orden, ~10 min cada uno, con su diapositiva:</w:t>
+        <w:t>Cubre estos conceptos, en este orden, ~7 min cada uno, con su diapositiva:</w:t>
       </w:r>
     </w:p>
     <w:p>
@@ -791,6 +804,27 @@
           <w:color w:val="4A4A49"/>
           <w:sz w:val="22"/>
         </w:rPr>
+        <w:t xml:space="preserve"> · [Slide 4]</w:t>
+      </w:r>
+    </w:p>
+    <w:p>
+      <w:pPr>
+        <w:pStyle w:val="ListBullet"/>
+      </w:pPr>
+      <w:r>
+        <w:rPr>
+          <w:b/>
+          <w:color w:val="4A4A49"/>
+          <w:sz w:val="22"/>
+        </w:rPr>
+        <w:t>Cómo decidir para CloudLite</w:t>
+      </w:r>
+      <w:r>
+        <w:rPr>
+          <w:b w:val="0"/>
+          <w:color w:val="4A4A49"/>
+          <w:sz w:val="22"/>
+        </w:rPr>
         <w:t xml:space="preserve"> · [Slide 5]</w:t>
       </w:r>
     </w:p>
@@ -804,7 +838,7 @@
           <w:color w:val="4A4A49"/>
           <w:sz w:val="22"/>
         </w:rPr>
-        <w:t>Cómo decidir para CloudLite</w:t>
+        <w:t>Responsabilidad compartida: quién responde por qué</w:t>
       </w:r>
       <w:r>
         <w:rPr>
@@ -1069,7 +1103,7 @@
           <w:color w:val="1A1C1D"/>
           <w:sz w:val="32"/>
         </w:rPr>
-        <w:t>55–100 · Taller guiado PI (individual · equipos de 2–3 solo si tú los autorizaste) · [Slide 11]</w:t>
+        <w:t>55–100 · Taller guiado PI (individual · equipos de 2–3 solo si tú los autorizaste) · [Slide 12]</w:t>
       </w:r>
     </w:p>
     <w:p>
@@ -1210,7 +1244,7 @@
           <w:color w:val="1A1C1D"/>
           <w:sz w:val="32"/>
         </w:rPr>
-        <w:t>115–120 · Cierre · [Slide 13]</w:t>
+        <w:t>115–120 · Cierre · [Slide 14]</w:t>
       </w:r>
     </w:p>
     <w:p>

</xml_diff>